<commit_message>
P00: address independent review findings M1-M9
- PW-003: AI proposals bind to a stored selection handle (no own range),
  at-most-once apply, guard always on; guard now checks quantity order,
  comparators, units, negation, direction, marks, citation locator and
  anchor; preserve_atom for math/figure atoms; per-block DOCX loss report.
- PW-002/004: realpath + ownership profile guard, auth sentinel required by
  decideModelCall and startProviderRun, Claude flag allowlist with
  --restricted, no runs below agent-config folders, hardlink/TOCTOU-safe
  input copy, runtime-user execution, scoped cleanup, Codex feature
  disables (unified_exec not disableable; untrusted policy rejected).
- PW-005: corrected survival statistics and DEG evidence; validator checks
  depth, retraction, group binding, null results and causal language.

Co-Authored-By: Claude Opus 5.5 <noreply@anthropic.com>
Claude-Session: https://claude.ai/code/session_01EeZdb6b7qndTXCACBK8Dee
</commit_message>
<xml_diff>
--- a/reports/tasks/PW-003/export-sample/manuscript.docx
+++ b/reports/tasks/PW-003/export-sample/manuscript.docx
@@ -117,6 +117,20 @@
       <w:r>
         <w:t xml:space="preserve">(Okafor 2019, 4)</w:t>
       </w:r>
+      <w:r>
+        <w:t xml:space="preserve">. See</w:t>
+      </w:r>
+      <w:r>
+        <w:t xml:space="preserve"> </w:t>
+      </w:r>
+      <w:hyperlink w:anchor="fig-1">
+        <w:r>
+          <w:rPr>
+            <w:rStyle w:val="Hyperlink"/>
+          </w:rPr>
+          <w:t xml:space="preserve">Figure</w:t>
+        </w:r>
+      </w:hyperlink>
       <w:r>
         <w:t xml:space="preserve">.</w:t>
       </w:r>
@@ -190,6 +204,35 @@
       </w:tr>
     </w:tbl>
     <w:bookmarkEnd w:id="20"/>
+    <w:p>
+      <w:pPr>
+        <w:pStyle w:val="BodyText"/>
+      </w:pPr>
+      <w:r>
+        <w:t xml:space="preserve">Group A had 1.2 and group B had 3.4 (p &lt; 0.05); 5 µM treatment increased growth and did not cause damage in 10</w:t>
+      </w:r>
+      <w:r>
+        <w:rPr>
+          <w:vertAlign w:val="superscript"/>
+        </w:rPr>
+        <w:t xml:space="preserve">5</w:t>
+      </w:r>
+      <w:r>
+        <w:t xml:space="preserve"> </w:t>
+      </w:r>
+      <w:r>
+        <w:t xml:space="preserve">cells</w:t>
+      </w:r>
+      <w:r>
+        <w:t xml:space="preserve"> </w:t>
+      </w:r>
+      <w:r>
+        <w:t xml:space="preserve">(Okafor 2019, 4)</w:t>
+      </w:r>
+      <w:r>
+        <w:t xml:space="preserve">.</w:t>
+      </w:r>
+    </w:p>
     <w:p>
       <w:pPr>
         <w:pStyle w:val="BodyText"/>

</xml_diff>